<commit_message>
moved init.sql to the root calling "student-init.sql", new labs
</commit_message>
<xml_diff>
--- a/lab-02/Отчет.docx
+++ b/lab-02/Отчет.docx
@@ -1657,7 +1657,7 @@
       <w:r>
         <w:drawing>
           <wp:inline>
-            <wp:extent cx="6108700" cy="3289300"/>
+            <wp:extent cx="5497830" cy="2960370"/>
             <wp:effectExtent b="0" l="0" r="0" t="0"/>
             <wp:docPr descr="Рисунок 1 – Результат выборки всех данных из таблицы dannie" title="" id="1" name="Picture"/>
             <a:graphic>
@@ -1678,7 +1678,7 @@
                   <pic:spPr bwMode="auto">
                     <a:xfrm>
                       <a:off x="0" y="0"/>
-                      <a:ext cx="6108700" cy="3289300"/>
+                      <a:ext cx="5497830" cy="2960370"/>
                     </a:xfrm>
                     <a:prstGeom prst="rect">
                       <a:avLst/>
@@ -1880,7 +1880,7 @@
       <w:r>
         <w:drawing>
           <wp:inline>
-            <wp:extent cx="4437246" cy="8585734"/>
+            <wp:extent cx="3665220" cy="7091922"/>
             <wp:effectExtent b="0" l="0" r="0" t="0"/>
             <wp:docPr descr="Рисунок 3 – Список фамилий студентов" title="" id="3" name="Picture"/>
             <a:graphic>
@@ -1901,7 +1901,7 @@
                   <pic:spPr bwMode="auto">
                     <a:xfrm>
                       <a:off x="0" y="0"/>
-                      <a:ext cx="4437246" cy="8585734"/>
+                      <a:ext cx="3665220" cy="7091922"/>
                     </a:xfrm>
                     <a:prstGeom prst="rect">
                       <a:avLst/>
@@ -1974,7 +1974,7 @@
       <w:r>
         <w:drawing>
           <wp:inline>
-            <wp:extent cx="5813658" cy="7825338"/>
+            <wp:extent cx="2443480" cy="3288988"/>
             <wp:effectExtent b="0" l="0" r="0" t="0"/>
             <wp:docPr descr="Рисунок 4 – Список названий групп" title="" id="4" name="Picture"/>
             <a:graphic>
@@ -1995,7 +1995,7 @@
                   <pic:spPr bwMode="auto">
                     <a:xfrm>
                       <a:off x="0" y="0"/>
-                      <a:ext cx="5813658" cy="7825338"/>
+                      <a:ext cx="2443480" cy="3288988"/>
                     </a:xfrm>
                     <a:prstGeom prst="rect">
                       <a:avLst/>
@@ -2076,7 +2076,7 @@
       <w:r>
         <w:drawing>
           <wp:inline>
-            <wp:extent cx="6108700" cy="3959952"/>
+            <wp:extent cx="5497830" cy="3563957"/>
             <wp:effectExtent b="0" l="0" r="0" t="0"/>
             <wp:docPr descr="Рисунок 5 – Фамилии, имена, телефоны и паспортные данные студентов" title="" id="5" name="Picture"/>
             <a:graphic>
@@ -2097,7 +2097,7 @@
                   <pic:spPr bwMode="auto">
                     <a:xfrm>
                       <a:off x="0" y="0"/>
-                      <a:ext cx="6108700" cy="3959952"/>
+                      <a:ext cx="5497830" cy="3563957"/>
                     </a:xfrm>
                     <a:prstGeom prst="rect">
                       <a:avLst/>
@@ -2170,7 +2170,7 @@
       <w:r>
         <w:drawing>
           <wp:inline>
-            <wp:extent cx="6108700" cy="8719025"/>
+            <wp:extent cx="4276090" cy="6103317"/>
             <wp:effectExtent b="0" l="0" r="0" t="0"/>
             <wp:docPr descr="Рисунок 6 – Фамилии родителей и их телефоны" title="" id="6" name="Picture"/>
             <a:graphic>
@@ -2191,7 +2191,7 @@
                   <pic:spPr bwMode="auto">
                     <a:xfrm>
                       <a:off x="0" y="0"/>
-                      <a:ext cx="6108700" cy="8719025"/>
+                      <a:ext cx="4276090" cy="6103317"/>
                     </a:xfrm>
                     <a:prstGeom prst="rect">
                       <a:avLst/>
@@ -2284,7 +2284,7 @@
       <w:r>
         <w:drawing>
           <wp:inline>
-            <wp:extent cx="6108700" cy="6910422"/>
+            <wp:extent cx="3054350" cy="3455211"/>
             <wp:effectExtent b="0" l="0" r="0" t="0"/>
             <wp:docPr descr="Рисунок 7 – Декартово произведение городов и улиц" title="" id="7" name="Picture"/>
             <a:graphic>
@@ -2305,7 +2305,7 @@
                   <pic:spPr bwMode="auto">
                     <a:xfrm>
                       <a:off x="0" y="0"/>
-                      <a:ext cx="6108700" cy="6910422"/>
+                      <a:ext cx="3054350" cy="3455211"/>
                     </a:xfrm>
                     <a:prstGeom prst="rect">
                       <a:avLst/>
@@ -2378,7 +2378,7 @@
       <w:r>
         <w:drawing>
           <wp:inline>
-            <wp:extent cx="6108700" cy="5501837"/>
+            <wp:extent cx="3054350" cy="2750918"/>
             <wp:effectExtent b="0" l="0" r="0" t="0"/>
             <wp:docPr descr="Рисунок 8 – Названия предметов и фамилии преподавателей" title="" id="8" name="Picture"/>
             <a:graphic>
@@ -2399,7 +2399,7 @@
                   <pic:spPr bwMode="auto">
                     <a:xfrm>
                       <a:off x="0" y="0"/>
-                      <a:ext cx="6108700" cy="5501837"/>
+                      <a:ext cx="3054350" cy="2750918"/>
                     </a:xfrm>
                     <a:prstGeom prst="rect">
                       <a:avLst/>
@@ -2426,6 +2426,11 @@
         <w:t xml:space="preserve">Рисунок 8 – Названия предметов и фамилии преподавателей</w:t>
       </w:r>
     </w:p>
+    <w:p>
+      <w:r>
+        <w:br w:type="page"/>
+      </w:r>
+    </w:p>
     <w:bookmarkEnd w:id="10"/>
     <w:bookmarkStart w:id="12" w:name="X6c0b55c70d8ce1efe260ce11c1923e294abda02"/>
     <w:p>
@@ -2517,7 +2522,7 @@
       <w:r>
         <w:drawing>
           <wp:inline>
-            <wp:extent cx="6108700" cy="7479883"/>
+            <wp:extent cx="3054350" cy="3739941"/>
             <wp:effectExtent b="0" l="0" r="0" t="0"/>
             <wp:docPr descr="Рисунок 9 – Фамилии и дата рождения студентов с псевдонимом поля" title="" id="9" name="Picture"/>
             <a:graphic>
@@ -2538,7 +2543,7 @@
                   <pic:spPr bwMode="auto">
                     <a:xfrm>
                       <a:off x="0" y="0"/>
-                      <a:ext cx="6108700" cy="7479883"/>
+                      <a:ext cx="3054350" cy="3739941"/>
                     </a:xfrm>
                     <a:prstGeom prst="rect">
                       <a:avLst/>
@@ -2623,7 +2628,7 @@
       <w:r>
         <w:drawing>
           <wp:inline>
-            <wp:extent cx="5678905" cy="9317254"/>
+            <wp:extent cx="4886960" cy="8017927"/>
             <wp:effectExtent b="0" l="0" r="0" t="0"/>
             <wp:docPr descr="Рисунок 10 – Названия улиц с переименованным полем" title="" id="10" name="Picture"/>
             <a:graphic>
@@ -2644,7 +2649,7 @@
                   <pic:spPr bwMode="auto">
                     <a:xfrm>
                       <a:off x="0" y="0"/>
-                      <a:ext cx="5678905" cy="9317254"/>
+                      <a:ext cx="4886960" cy="8017927"/>
                     </a:xfrm>
                     <a:prstGeom prst="rect">
                       <a:avLst/>
@@ -2671,6 +2676,11 @@
         <w:t xml:space="preserve">Рисунок 10 – Названия улиц с переименованным полем</w:t>
       </w:r>
     </w:p>
+    <w:p>
+      <w:r>
+        <w:br w:type="page"/>
+      </w:r>
+    </w:p>
     <w:bookmarkEnd w:id="12"/>
     <w:bookmarkStart w:id="14" w:name="X6e979e9e9dd31973ed5c9cd007fce519e77532c"/>
     <w:p>
@@ -2752,7 +2762,7 @@
       <w:r>
         <w:drawing>
           <wp:inline>
-            <wp:extent cx="5736656" cy="8412480"/>
+            <wp:extent cx="4886960" cy="7166448"/>
             <wp:effectExtent b="0" l="0" r="0" t="0"/>
             <wp:docPr descr="Рисунок 11 – Уникальные названия улиц" title="" id="11" name="Picture"/>
             <a:graphic>
@@ -2773,7 +2783,7 @@
                   <pic:spPr bwMode="auto">
                     <a:xfrm>
                       <a:off x="0" y="0"/>
-                      <a:ext cx="5736656" cy="8412480"/>
+                      <a:ext cx="4886960" cy="7166448"/>
                     </a:xfrm>
                     <a:prstGeom prst="rect">
                       <a:avLst/>
@@ -2800,6 +2810,11 @@
         <w:t xml:space="preserve">Рисунок 11 – Уникальные названия улиц</w:t>
       </w:r>
     </w:p>
+    <w:p>
+      <w:r>
+        <w:br w:type="page"/>
+      </w:r>
+    </w:p>
     <w:bookmarkEnd w:id="13"/>
     <w:bookmarkStart w:id="15" w:name="Xc07b6d738f942d62e0758c04ef4f657e0eb3bcc"/>
     <w:p>
@@ -2858,7 +2873,7 @@
       <w:r>
         <w:drawing>
           <wp:inline>
-            <wp:extent cx="5245768" cy="9442383"/>
+            <wp:extent cx="4276090" cy="7696962"/>
             <wp:effectExtent b="0" l="0" r="0" t="0"/>
             <wp:docPr descr="Рисунок 12 – Уникальные имена студентов" title="" id="12" name="Picture"/>
             <a:graphic>
@@ -2879,7 +2894,7 @@
                   <pic:spPr bwMode="auto">
                     <a:xfrm>
                       <a:off x="0" y="0"/>
-                      <a:ext cx="5245768" cy="9442383"/>
+                      <a:ext cx="4276090" cy="7696962"/>
                     </a:xfrm>
                     <a:prstGeom prst="rect">
                       <a:avLst/>
@@ -3011,7 +3026,7 @@
       <w:r>
         <w:drawing>
           <wp:inline>
-            <wp:extent cx="6108700" cy="5137480"/>
+            <wp:extent cx="3054350" cy="2568740"/>
             <wp:effectExtent b="0" l="0" r="0" t="0"/>
             <wp:docPr descr="Рисунок 13 – Первая специальность в списке" title="" id="13" name="Picture"/>
             <a:graphic>
@@ -3032,7 +3047,7 @@
                   <pic:spPr bwMode="auto">
                     <a:xfrm>
                       <a:off x="0" y="0"/>
-                      <a:ext cx="6108700" cy="5137480"/>
+                      <a:ext cx="3054350" cy="2568740"/>
                     </a:xfrm>
                     <a:prstGeom prst="rect">
                       <a:avLst/>
@@ -3170,7 +3185,7 @@
       <w:r>
         <w:drawing>
           <wp:inline>
-            <wp:extent cx="6108700" cy="3517274"/>
+            <wp:extent cx="3054350" cy="1758637"/>
             <wp:effectExtent b="0" l="0" r="0" t="0"/>
             <wp:docPr descr="Рисунок 14 – Строки с 6 по 10 из таблицы roditeli" title="" id="14" name="Picture"/>
             <a:graphic>
@@ -3191,7 +3206,7 @@
                   <pic:spPr bwMode="auto">
                     <a:xfrm>
                       <a:off x="0" y="0"/>
-                      <a:ext cx="6108700" cy="3517274"/>
+                      <a:ext cx="3054350" cy="1758637"/>
                     </a:xfrm>
                     <a:prstGeom prst="rect">
                       <a:avLst/>
@@ -3296,7 +3311,7 @@
           <wp:inline>
             <wp:extent cx="6108700" cy="4961760"/>
             <wp:effectExtent b="0" l="0" r="0" t="0"/>
-            <wp:docPr descr="Рисунок – Таблица dannie в Prisma Studio" title="" id="15" name="Picture"/>
+            <wp:docPr descr="Рисунок 15 – Таблица dannie в Prisma Studio" title="" id="15" name="Picture"/>
             <a:graphic>
               <a:graphicData uri="http://schemas.openxmlformats.org/drawingml/2006/picture">
                 <pic:pic>
@@ -3339,7 +3354,7 @@
         <w:pStyle w:val="ImageCaption"/>
       </w:pPr>
       <w:r>
-        <w:t xml:space="preserve">Рисунок – Таблица dannie в Prisma Studio</w:t>
+        <w:t xml:space="preserve">Рисунок 15 – Таблица dannie в Prisma Studio</w:t>
       </w:r>
     </w:p>
     <w:p>
@@ -3374,7 +3389,7 @@
           <wp:inline>
             <wp:extent cx="6108700" cy="3205212"/>
             <wp:effectExtent b="0" l="0" r="0" t="0"/>
-            <wp:docPr descr="Рисунок – Список таблиц базы данных в phpMyAdmin" title="" id="16" name="Picture"/>
+            <wp:docPr descr="Рисунок 16 – Список таблиц базы данных в phpMyAdmin" title="" id="16" name="Picture"/>
             <a:graphic>
               <a:graphicData uri="http://schemas.openxmlformats.org/drawingml/2006/picture">
                 <pic:pic>
@@ -3417,7 +3432,7 @@
         <w:pStyle w:val="ImageCaption"/>
       </w:pPr>
       <w:r>
-        <w:t xml:space="preserve">Рисунок – Список таблиц базы данных в phpMyAdmin</w:t>
+        <w:t xml:space="preserve">Рисунок 16 – Список таблиц базы данных в phpMyAdmin</w:t>
       </w:r>
     </w:p>
     <w:p>
@@ -3449,7 +3464,7 @@
           <wp:inline>
             <wp:extent cx="6108700" cy="3821511"/>
             <wp:effectExtent b="0" l="0" r="0" t="0"/>
-            <wp:docPr descr="Рисунок – Диаграмма связей базы данных в Prisma Studio" title="" id="17" name="Picture"/>
+            <wp:docPr descr="Рисунок 17 – Диаграмма связей базы данных в Prisma Studio" title="" id="17" name="Picture"/>
             <a:graphic>
               <a:graphicData uri="http://schemas.openxmlformats.org/drawingml/2006/picture">
                 <pic:pic>
@@ -3492,7 +3507,12 @@
         <w:pStyle w:val="ImageCaption"/>
       </w:pPr>
       <w:r>
-        <w:t xml:space="preserve">Рисунок – Диаграмма связей базы данных в Prisma Studio</w:t>
+        <w:t xml:space="preserve">Рисунок 17 – Диаграмма связей базы данных в Prisma Studio</w:t>
+      </w:r>
+    </w:p>
+    <w:p>
+      <w:r>
+        <w:br w:type="page"/>
       </w:r>
     </w:p>
     <w:bookmarkEnd w:id="18"/>
@@ -3592,11 +3612,6 @@
       <w:pgNumType/>
       <w:docGrid w:linePitch="360"/>
     </w:sectPr>
-    <w:p>
-      <w:r>
-        <w:br w:type="page"/>
-      </w:r>
-    </w:p>
   </w:body>
 </w:document>
 </file>
@@ -3991,6 +4006,7 @@
       <w:rFonts w:ascii="Times New Roman" w:cs="Times New Roman" w:eastAsia="Times New Roman" w:hAnsi="Times New Roman"/>
       <w:b/>
       <w:bCs/>
+      <w:caps/>
       <w:color w:val="000000"/>
       <w:sz w:val="28"/>
       <w:szCs w:val="28"/>
@@ -4072,7 +4088,7 @@
     <w:name w:val="Image Caption"/>
     <w:basedOn w:val="Normal"/>
     <w:pPr>
-      <w:spacing w:after="0" w:before="0" w:line="360" w:lineRule="auto"/>
+      <w:spacing w:after="240" w:before="0" w:line="360" w:lineRule="auto"/>
       <w:ind w:firstLine="0"/>
       <w:jc w:val="center"/>
     </w:pPr>
@@ -4106,6 +4122,15 @@
     <w:basedOn w:val="Normal"/>
     <w:pPr>
       <w:ind w:firstLine="709"/>
+    </w:pPr>
+  </w:style>
+  <w:style w:type="paragraph" w:styleId="pagebreak">
+    <w:name w:val="pagebreak"/>
+    <w:basedOn w:val="Normal"/>
+    <w:pPr>
+      <w:pageBreakBefore/>
+      <w:spacing w:after="0" w:before="0" w:line="240" w:lineRule="auto"/>
+      <w:ind w:firstLine="0"/>
     </w:pPr>
   </w:style>
   <w:style w:type="table" w:styleId="Table">

</xml_diff>